<commit_message>
fix(LoginForm, SuratTugasForm): update error handling and improve document template placeholders
</commit_message>
<xml_diff>
--- a/templates/Template Surat Tugas (1).docx
+++ b/templates/Template Surat Tugas (1).docx
@@ -410,13 +410,6 @@
           <w:rFonts w:ascii="Arial" w:hAnsi="Arial" w:cs="Arial"/>
           <w:lang w:val="en-GB"/>
         </w:rPr>
-        <w:t>$</w:t>
-      </w:r>
-      <w:r>
-        <w:rPr>
-          <w:rFonts w:ascii="Arial" w:hAnsi="Arial" w:cs="Arial"/>
-          <w:lang w:val="en-GB"/>
-        </w:rPr>
         <w:t>{</w:t>
       </w:r>
       <w:proofErr w:type="spellStart"/>
@@ -600,7 +593,7 @@
               <w:rPr>
                 <w:rFonts w:ascii="Arial" w:hAnsi="Arial" w:cs="Arial"/>
               </w:rPr>
-              <w:t xml:space="preserve"> $</w:t>
+              <w:t xml:space="preserve"> </w:t>
             </w:r>
             <w:r>
               <w:rPr>
@@ -1125,13 +1118,6 @@
                 <w:rFonts w:ascii="Arial" w:hAnsi="Arial" w:cs="Arial"/>
                 <w:lang w:val="id-ID"/>
               </w:rPr>
-              <w:t>$</w:t>
-            </w:r>
-            <w:r>
-              <w:rPr>
-                <w:rFonts w:ascii="Arial" w:hAnsi="Arial" w:cs="Arial"/>
-                <w:lang w:val="id-ID"/>
-              </w:rPr>
               <w:t>{</w:t>
             </w:r>
             <w:proofErr w:type="spellStart"/>
@@ -1156,12 +1142,6 @@
                 <w:lang w:val="id-ID"/>
               </w:rPr>
               <w:t xml:space="preserve"> tanggal </w:t>
-            </w:r>
-            <w:r>
-              <w:rPr>
-                <w:rFonts w:ascii="Arial" w:hAnsi="Arial" w:cs="Arial"/>
-              </w:rPr>
-              <w:t>$</w:t>
             </w:r>
             <w:r>
               <w:rPr>
@@ -1376,12 +1356,6 @@
               <w:rPr>
                 <w:rFonts w:ascii="Arial" w:hAnsi="Arial" w:cs="Arial"/>
               </w:rPr>
-              <w:t xml:space="preserve"> $</w:t>
-            </w:r>
-            <w:r>
-              <w:rPr>
-                <w:rFonts w:ascii="Arial" w:hAnsi="Arial" w:cs="Arial"/>
-              </w:rPr>
               <w:t>{</w:t>
             </w:r>
             <w:proofErr w:type="spellStart"/>
@@ -1511,13 +1485,6 @@
                 <w:rFonts w:ascii="Arial" w:hAnsi="Arial" w:cs="Arial"/>
                 <w:color w:val="000000"/>
               </w:rPr>
-              <w:t xml:space="preserve"> $</w:t>
-            </w:r>
-            <w:r>
-              <w:rPr>
-                <w:rFonts w:ascii="Arial" w:hAnsi="Arial" w:cs="Arial"/>
-                <w:color w:val="000000"/>
-              </w:rPr>
               <w:t>{</w:t>
             </w:r>
             <w:proofErr w:type="spellStart"/>
@@ -1643,13 +1610,6 @@
                 <w:rFonts w:ascii="Arial" w:hAnsi="Arial" w:cs="Arial"/>
                 <w:lang w:val="id-ID"/>
               </w:rPr>
-              <w:t xml:space="preserve"> $</w:t>
-            </w:r>
-            <w:r>
-              <w:rPr>
-                <w:rFonts w:ascii="Arial" w:hAnsi="Arial" w:cs="Arial"/>
-                <w:lang w:val="id-ID"/>
-              </w:rPr>
               <w:t>{</w:t>
             </w:r>
             <w:proofErr w:type="spellStart"/>
@@ -1772,12 +1732,6 @@
               <w:rPr>
                 <w:rFonts w:ascii="Arial" w:hAnsi="Arial" w:cs="Arial"/>
               </w:rPr>
-              <w:t xml:space="preserve"> $</w:t>
-            </w:r>
-            <w:r>
-              <w:rPr>
-                <w:rFonts w:ascii="Arial" w:hAnsi="Arial" w:cs="Arial"/>
-              </w:rPr>
               <w:t>{</w:t>
             </w:r>
             <w:proofErr w:type="spellStart"/>
@@ -1910,7 +1864,7 @@
                 <w:rFonts w:ascii="Arial" w:hAnsi="Arial" w:cs="Arial"/>
                 <w:lang w:val="id-ID"/>
               </w:rPr>
-              <w:t xml:space="preserve"> $</w:t>
+              <w:t xml:space="preserve"> </w:t>
             </w:r>
             <w:r>
               <w:rPr>
@@ -1938,7 +1892,7 @@
                 <w:rFonts w:ascii="Arial" w:hAnsi="Arial" w:cs="Arial"/>
                 <w:lang w:val="id-ID"/>
               </w:rPr>
-              <w:t xml:space="preserve"> $</w:t>
+              <w:t xml:space="preserve"> </w:t>
             </w:r>
             <w:r>
               <w:rPr>
@@ -1973,7 +1927,7 @@
                 <w:rFonts w:ascii="Arial" w:hAnsi="Arial" w:cs="Arial"/>
                 <w:lang w:val="id-ID"/>
               </w:rPr>
-              <w:t xml:space="preserve"> $</w:t>
+              <w:t xml:space="preserve"> </w:t>
             </w:r>
             <w:r>
               <w:rPr>
@@ -2099,7 +2053,7 @@
         <w:rPr>
           <w:rFonts w:ascii="Arial" w:hAnsi="Arial"/>
         </w:rPr>
-        <w:t xml:space="preserve"> $</w:t>
+        <w:t xml:space="preserve"> </w:t>
       </w:r>
       <w:r>
         <w:rPr>
@@ -2213,7 +2167,7 @@
         <w:rPr>
           <w:rFonts w:ascii="Arial" w:hAnsi="Arial"/>
         </w:rPr>
-        <w:t>${</w:t>
+        <w:t>{</w:t>
       </w:r>
       <w:proofErr w:type="spellStart"/>
       <w:r>
@@ -2711,7 +2665,7 @@
           <w:rFonts w:ascii="Arial" w:hAnsi="Arial" w:cs="Arial"/>
           <w:lang w:val="en-GB"/>
         </w:rPr>
-        <w:t>${</w:t>
+        <w:t>{</w:t>
       </w:r>
       <w:proofErr w:type="spellStart"/>
       <w:r>
@@ -2893,7 +2847,7 @@
               <w:rPr>
                 <w:rFonts w:ascii="Arial" w:hAnsi="Arial" w:cs="Arial"/>
               </w:rPr>
-              <w:t xml:space="preserve"> ${</w:t>
+              <w:t xml:space="preserve"> {</w:t>
             </w:r>
             <w:proofErr w:type="spellStart"/>
             <w:r>
@@ -3409,7 +3363,7 @@
                 <w:rFonts w:ascii="Arial" w:hAnsi="Arial" w:cs="Arial"/>
                 <w:lang w:val="id-ID"/>
               </w:rPr>
-              <w:t xml:space="preserve">${dasar_dipa} </w:t>
+              <w:t xml:space="preserve">{dasar_dipa} </w:t>
             </w:r>
             <w:r>
               <w:rPr>
@@ -3422,7 +3376,7 @@
               <w:rPr>
                 <w:rFonts w:ascii="Arial" w:hAnsi="Arial" w:cs="Arial"/>
               </w:rPr>
-              <w:t>${</w:t>
+              <w:t>{</w:t>
             </w:r>
             <w:proofErr w:type="spellStart"/>
             <w:r>
@@ -3563,7 +3517,7 @@
               <w:rPr>
                 <w:rFonts w:ascii="Arial" w:hAnsi="Arial" w:cs="Arial"/>
               </w:rPr>
-              <w:t>${</w:t>
+              <w:t>{</w:t>
             </w:r>
             <w:proofErr w:type="spellStart"/>
             <w:r>
@@ -3579,6 +3533,13 @@
               </w:rPr>
               <w:t>}</w:t>
             </w:r>
+          </w:p>
+          <w:p>
+            <w:pPr>
+              <w:rPr>
+                <w:rFonts w:ascii="Arial" w:hAnsi="Arial" w:cs="Arial"/>
+              </w:rPr>
+            </w:pPr>
           </w:p>
         </w:tc>
       </w:tr>
@@ -3640,7 +3601,7 @@
                 <w:rFonts w:ascii="Arial" w:hAnsi="Arial" w:cs="Arial"/>
                 <w:lang w:val="id-ID"/>
               </w:rPr>
-              <w:t>Mengikuti ${tujuan_kegiatan} pada tanggal ${tanggal_mulai} s.d ${tanggal_selesai}</w:t>
+              <w:t>Mengikuti {tujuan_kegiatan} pada tanggal {tanggal_mulai} s.d {tanggal_selesai}</w:t>
             </w:r>
           </w:p>
           <w:p>
@@ -3720,7 +3681,7 @@
         <w:rPr>
           <w:rFonts w:ascii="Arial" w:hAnsi="Arial"/>
         </w:rPr>
-        <w:t>${</w:t>
+        <w:t>{</w:t>
       </w:r>
       <w:proofErr w:type="spellStart"/>
       <w:r>
@@ -3876,7 +3837,7 @@
           <w:rFonts w:ascii="Arial" w:hAnsi="Arial"/>
           <w:lang w:val="id-ID"/>
         </w:rPr>
-        <w:t>${nama</w:t>
+        <w:t>{nama</w:t>
       </w:r>
       <w:r>
         <w:rPr>

</xml_diff>

<commit_message>
Integrate Surat Tugas + SPD input into unified form
</commit_message>
<xml_diff>
--- a/templates/Template Surat Tugas (1).docx
+++ b/templates/Template Surat Tugas (1).docx
@@ -1,6 +1,6 @@
 
 <file path=word/document.xml><?xml version="1.0" encoding="utf-8"?>
-<w:document xmlns:wpc="http://schemas.microsoft.com/office/word/2010/wordprocessingCanvas" xmlns:cx="http://schemas.microsoft.com/office/drawing/2014/chartex" xmlns:cx1="http://schemas.microsoft.com/office/drawing/2015/9/8/chartex" xmlns:cx2="http://schemas.microsoft.com/office/drawing/2015/10/21/chartex" xmlns:cx3="http://schemas.microsoft.com/office/drawing/2016/5/9/chartex" xmlns:cx4="http://schemas.microsoft.com/office/drawing/2016/5/10/chartex" xmlns:cx5="http://schemas.microsoft.com/office/drawing/2016/5/11/chartex" xmlns:cx6="http://schemas.microsoft.com/office/drawing/2016/5/12/chartex" xmlns:cx7="http://schemas.microsoft.com/office/drawing/2016/5/13/chartex" xmlns:cx8="http://schemas.microsoft.com/office/drawing/2016/5/14/chartex" xmlns:mc="http://schemas.openxmlformats.org/markup-compatibility/2006" xmlns:aink="http://schemas.microsoft.com/office/drawing/2016/ink" xmlns:am3d="http://schemas.microsoft.com/office/drawing/2017/model3d" xmlns:o="urn:schemas-microsoft-com:office:office" xmlns:oel="http://schemas.microsoft.com/office/2019/extlst" xmlns:r="http://schemas.openxmlformats.org/officeDocument/2006/relationships" xmlns:m="http://schemas.openxmlformats.org/officeDocument/2006/math" xmlns:v="urn:schemas-microsoft-com:vml" xmlns:wp14="http://schemas.microsoft.com/office/word/2010/wordprocessingDrawing" xmlns:wp="http://schemas.openxmlformats.org/drawingml/2006/wordprocessingDrawing" xmlns:w10="urn:schemas-microsoft-com:office:word" xmlns:w="http://schemas.openxmlformats.org/wordprocessingml/2006/main" xmlns:w14="http://schemas.microsoft.com/office/word/2010/wordml" xmlns:w15="http://schemas.microsoft.com/office/word/2012/wordml" xmlns:w16cex="http://schemas.microsoft.com/office/word/2018/wordml/cex" xmlns:w16cid="http://schemas.microsoft.com/office/word/2016/wordml/cid" xmlns:w16="http://schemas.microsoft.com/office/word/2018/wordml" xmlns:w16du="http://schemas.microsoft.com/office/word/2023/wordml/word16du" xmlns:w16sdtdh="http://schemas.microsoft.com/office/word/2020/wordml/sdtdatahash" xmlns:w16sdtfl="http://schemas.microsoft.com/office/word/2024/wordml/sdtformatlock" xmlns:w16se="http://schemas.microsoft.com/office/word/2015/wordml/symex" xmlns:wpg="http://schemas.microsoft.com/office/word/2010/wordprocessingGroup" xmlns:wpi="http://schemas.microsoft.com/office/word/2010/wordprocessingInk" xmlns:wne="http://schemas.microsoft.com/office/word/2006/wordml" xmlns:wps="http://schemas.microsoft.com/office/word/2010/wordprocessingShape" mc:Ignorable="w14 w15 w16se w16cid w16 w16cex w16sdtdh w16sdtfl w16du wp14">
+<w:document xmlns:wpc="http://schemas.microsoft.com/office/word/2010/wordprocessingCanvas" xmlns:cx="http://schemas.microsoft.com/office/drawing/2014/chartex" xmlns:cx1="http://schemas.microsoft.com/office/drawing/2015/9/8/chartex" xmlns:cx2="http://schemas.microsoft.com/office/drawing/2015/10/21/chartex" xmlns:cx3="http://schemas.microsoft.com/office/drawing/2016/5/9/chartex" xmlns:cx4="http://schemas.microsoft.com/office/drawing/2016/5/10/chartex" xmlns:cx5="http://schemas.microsoft.com/office/drawing/2016/5/11/chartex" xmlns:cx6="http://schemas.microsoft.com/office/drawing/2016/5/12/chartex" xmlns:cx7="http://schemas.microsoft.com/office/drawing/2016/5/13/chartex" xmlns:cx8="http://schemas.microsoft.com/office/drawing/2016/5/14/chartex" xmlns:mc="http://schemas.openxmlformats.org/markup-compatibility/2006" xmlns:aink="http://schemas.microsoft.com/office/drawing/2016/ink" xmlns:am3d="http://schemas.microsoft.com/office/drawing/2017/model3d" xmlns:o="urn:schemas-microsoft-com:office:office" xmlns:oel="http://schemas.microsoft.com/office/2019/extlst" xmlns:r="http://schemas.openxmlformats.org/officeDocument/2006/relationships" xmlns:m="http://schemas.openxmlformats.org/officeDocument/2006/math" xmlns:v="urn:schemas-microsoft-com:vml" xmlns:wp14="http://schemas.microsoft.com/office/word/2010/wordprocessingDrawing" xmlns:wp="http://schemas.openxmlformats.org/drawingml/2006/wordprocessingDrawing" xmlns:w10="urn:schemas-microsoft-com:office:word" xmlns:w="http://schemas.openxmlformats.org/wordprocessingml/2006/main" xmlns:w14="http://schemas.microsoft.com/office/word/2010/wordml" xmlns:w15="http://schemas.microsoft.com/office/word/2012/wordml" xmlns:w16cex="http://schemas.microsoft.com/office/word/2018/wordml/cex" xmlns:w16cid="http://schemas.microsoft.com/office/word/2016/wordml/cid" xmlns:w16="http://schemas.microsoft.com/office/word/2018/wordml" xmlns:w16du="http://schemas.microsoft.com/office/word/2023/wordml/word16du" xmlns:w16sdtdh="http://schemas.microsoft.com/office/word/2020/wordml/sdtdatahash" xmlns:w16se="http://schemas.microsoft.com/office/word/2015/wordml/symex" xmlns:wpg="http://schemas.microsoft.com/office/word/2010/wordprocessingGroup" xmlns:wpi="http://schemas.microsoft.com/office/word/2010/wordprocessingInk" xmlns:wne="http://schemas.microsoft.com/office/word/2006/wordml" xmlns:wps="http://schemas.microsoft.com/office/word/2010/wordprocessingShape" mc:Ignorable="w14 w15 w16se w16cid w16 w16cex w16sdtdh wp14">
   <w:body>
     <w:p>
       <w:pPr>
@@ -164,7 +164,7 @@
           <w:sz w:val="16"/>
           <w:szCs w:val="16"/>
         </w:rPr>
-        <w:t xml:space="preserve"> Kelurahan Balai </w:t>
+        <w:t xml:space="preserve"> </w:t>
       </w:r>
       <w:proofErr w:type="spellStart"/>
       <w:r>
@@ -173,7 +173,7 @@
           <w:sz w:val="16"/>
           <w:szCs w:val="16"/>
         </w:rPr>
-        <w:t>Gadang</w:t>
+        <w:t>Kelurahan</w:t>
       </w:r>
       <w:proofErr w:type="spellEnd"/>
       <w:r>
@@ -182,7 +182,43 @@
           <w:sz w:val="16"/>
           <w:szCs w:val="16"/>
         </w:rPr>
-        <w:t xml:space="preserve"> Kecamatan Koto </w:t>
+        <w:t xml:space="preserve"> Balai </w:t>
+      </w:r>
+      <w:proofErr w:type="spellStart"/>
+      <w:r>
+        <w:rPr>
+          <w:rFonts w:ascii="Arial" w:hAnsi="Arial"/>
+          <w:sz w:val="16"/>
+          <w:szCs w:val="16"/>
+        </w:rPr>
+        <w:t>Gadang</w:t>
+      </w:r>
+      <w:proofErr w:type="spellEnd"/>
+      <w:r>
+        <w:rPr>
+          <w:rFonts w:ascii="Arial" w:hAnsi="Arial"/>
+          <w:sz w:val="16"/>
+          <w:szCs w:val="16"/>
+        </w:rPr>
+        <w:t xml:space="preserve"> </w:t>
+      </w:r>
+      <w:proofErr w:type="spellStart"/>
+      <w:r>
+        <w:rPr>
+          <w:rFonts w:ascii="Arial" w:hAnsi="Arial"/>
+          <w:sz w:val="16"/>
+          <w:szCs w:val="16"/>
+        </w:rPr>
+        <w:t>Kecamatan</w:t>
+      </w:r>
+      <w:proofErr w:type="spellEnd"/>
+      <w:r>
+        <w:rPr>
+          <w:rFonts w:ascii="Arial" w:hAnsi="Arial"/>
+          <w:sz w:val="16"/>
+          <w:szCs w:val="16"/>
+        </w:rPr>
+        <w:t xml:space="preserve"> Koto </w:t>
       </w:r>
       <w:proofErr w:type="spellStart"/>
       <w:r>
@@ -325,7 +361,7 @@
               </wp:anchor>
             </w:drawing>
           </mc:Choice>
-          <mc:Fallback>
+          <mc:Fallback xmlns:w16sdtfl="http://schemas.microsoft.com/office/word/2024/wordml/sdtformatlock">
             <w:pict>
               <v:line w14:anchorId="5378192D" id="Straight Connector 3" o:spid="_x0000_s1026" style="position:absolute;z-index:251658240;visibility:visible;mso-wrap-style:square;mso-width-percent:0;mso-height-percent:0;mso-wrap-distance-left:9pt;mso-wrap-distance-top:0;mso-wrap-distance-right:9pt;mso-wrap-distance-bottom:0;mso-position-horizontal:absolute;mso-position-horizontal-relative:margin;mso-position-vertical:absolute;mso-position-vertical-relative:text;mso-width-percent:0;mso-height-percent:0;mso-width-relative:page;mso-height-relative:page" from="-6.4pt,5.4pt" to="459.05pt,6.3pt" o:gfxdata="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" strokecolor="windowText" strokeweight="3.5pt">
                 <v:stroke linestyle="thickThin" joinstyle="miter"/>
@@ -581,63 +617,59 @@
               </w:rPr>
               <w:t xml:space="preserve">bahwa sehubungan dengan </w:t>
             </w:r>
+            <w:r>
+              <w:rPr>
+                <w:rFonts w:ascii="Arial" w:hAnsi="Arial" w:cs="Arial"/>
+              </w:rPr>
+              <w:t>kegiatan</w:t>
+            </w:r>
+            <w:r>
+              <w:rPr>
+                <w:rFonts w:ascii="Arial" w:hAnsi="Arial" w:cs="Arial"/>
+              </w:rPr>
+              <w:t xml:space="preserve"> </w:t>
+            </w:r>
+            <w:r>
+              <w:rPr>
+                <w:rFonts w:ascii="Arial" w:hAnsi="Arial" w:cs="Arial"/>
+              </w:rPr>
+              <w:t>{</w:t>
+            </w:r>
             <w:proofErr w:type="spellStart"/>
             <w:r>
               <w:rPr>
                 <w:rFonts w:ascii="Arial" w:hAnsi="Arial" w:cs="Arial"/>
+                <w:lang w:val="en-ID"/>
+              </w:rPr>
+              <w:t>menimbang_kegiatan</w:t>
+            </w:r>
+            <w:proofErr w:type="spellEnd"/>
+            <w:r>
+              <w:rPr>
+                <w:rFonts w:ascii="Arial" w:hAnsi="Arial" w:cs="Arial"/>
+                <w:lang w:val="en-ID"/>
+              </w:rPr>
+              <w:t>}</w:t>
+            </w:r>
+            <w:r>
+              <w:rPr>
+                <w:rFonts w:ascii="Arial" w:hAnsi="Arial" w:cs="Arial"/>
+              </w:rPr>
+              <w:t xml:space="preserve">, </w:t>
+            </w:r>
+            <w:r>
+              <w:rPr>
+                <w:rFonts w:ascii="Arial" w:hAnsi="Arial" w:cs="Arial"/>
+                <w:lang w:val="id-ID"/>
+              </w:rPr>
+              <w:t xml:space="preserve">maka perlu diutus pihak terkait untuk </w:t>
+            </w:r>
+            <w:r>
+              <w:rPr>
+                <w:rFonts w:ascii="Arial" w:hAnsi="Arial" w:cs="Arial"/>
               </w:rPr>
               <w:t>kegiatan</w:t>
             </w:r>
-            <w:proofErr w:type="spellEnd"/>
-            <w:r>
-              <w:rPr>
-                <w:rFonts w:ascii="Arial" w:hAnsi="Arial" w:cs="Arial"/>
-              </w:rPr>
-              <w:t xml:space="preserve"> </w:t>
-            </w:r>
-            <w:r>
-              <w:rPr>
-                <w:rFonts w:ascii="Arial" w:hAnsi="Arial" w:cs="Arial"/>
-              </w:rPr>
-              <w:t>{</w:t>
-            </w:r>
-            <w:proofErr w:type="spellStart"/>
-            <w:r>
-              <w:rPr>
-                <w:rFonts w:ascii="Arial" w:hAnsi="Arial" w:cs="Arial"/>
-                <w:lang w:val="en-ID"/>
-              </w:rPr>
-              <w:t>menimbang_kegiatan</w:t>
-            </w:r>
-            <w:proofErr w:type="spellEnd"/>
-            <w:r>
-              <w:rPr>
-                <w:rFonts w:ascii="Arial" w:hAnsi="Arial" w:cs="Arial"/>
-                <w:lang w:val="en-ID"/>
-              </w:rPr>
-              <w:t>}</w:t>
-            </w:r>
-            <w:r>
-              <w:rPr>
-                <w:rFonts w:ascii="Arial" w:hAnsi="Arial" w:cs="Arial"/>
-              </w:rPr>
-              <w:t xml:space="preserve">, </w:t>
-            </w:r>
-            <w:r>
-              <w:rPr>
-                <w:rFonts w:ascii="Arial" w:hAnsi="Arial" w:cs="Arial"/>
-                <w:lang w:val="id-ID"/>
-              </w:rPr>
-              <w:t xml:space="preserve">maka perlu diutus pihak terkait untuk </w:t>
-            </w:r>
-            <w:proofErr w:type="spellStart"/>
-            <w:r>
-              <w:rPr>
-                <w:rFonts w:ascii="Arial" w:hAnsi="Arial" w:cs="Arial"/>
-              </w:rPr>
-              <w:t>kegiatan</w:t>
-            </w:r>
-            <w:proofErr w:type="spellEnd"/>
             <w:r>
               <w:rPr>
                 <w:rFonts w:ascii="Arial" w:hAnsi="Arial" w:cs="Arial"/>
@@ -1189,34 +1221,14 @@
           <w:bCs/>
         </w:rPr>
       </w:pPr>
-      <w:proofErr w:type="spellStart"/>
       <w:r>
         <w:rPr>
           <w:rFonts w:ascii="Arial" w:hAnsi="Arial" w:cs="Arial"/>
           <w:b/>
           <w:bCs/>
         </w:rPr>
-        <w:t>Memberi</w:t>
-      </w:r>
-      <w:proofErr w:type="spellEnd"/>
-      <w:r>
-        <w:rPr>
-          <w:rFonts w:ascii="Arial" w:hAnsi="Arial" w:cs="Arial"/>
-          <w:b/>
-          <w:bCs/>
-        </w:rPr>
-        <w:t xml:space="preserve"> </w:t>
-      </w:r>
-      <w:proofErr w:type="spellStart"/>
-      <w:r>
-        <w:rPr>
-          <w:rFonts w:ascii="Arial" w:hAnsi="Arial" w:cs="Arial"/>
-          <w:b/>
-          <w:bCs/>
-        </w:rPr>
-        <w:t>Tugas</w:t>
-      </w:r>
-      <w:proofErr w:type="spellEnd"/>
+        <w:t>Memberi Tugas</w:t>
+      </w:r>
     </w:p>
     <w:p>
       <w:pPr>
@@ -2248,1622 +2260,6 @@
         </w:rPr>
       </w:pPr>
     </w:p>
-    <w:p>
-      <w:pPr>
-        <w:jc w:val="both"/>
-        <w:rPr>
-          <w:rFonts w:ascii="Arial" w:hAnsi="Arial"/>
-          <w:lang w:val="id-ID"/>
-        </w:rPr>
-      </w:pPr>
-    </w:p>
-    <w:p>
-      <w:pPr>
-        <w:jc w:val="both"/>
-        <w:rPr>
-          <w:rFonts w:ascii="Arial" w:hAnsi="Arial"/>
-          <w:b/>
-          <w:bCs/>
-          <w:lang w:val="id-ID"/>
-        </w:rPr>
-      </w:pPr>
-    </w:p>
-    <w:p>
-      <w:pPr>
-        <w:ind w:left="720" w:firstLine="720"/>
-        <w:jc w:val="center"/>
-        <w:rPr>
-          <w:rFonts w:ascii="Arial" w:hAnsi="Arial"/>
-          <w:sz w:val="28"/>
-          <w:szCs w:val="28"/>
-        </w:rPr>
-      </w:pPr>
-      <w:r>
-        <w:rPr>
-          <w:noProof/>
-        </w:rPr>
-        <w:drawing>
-          <wp:anchor distT="0" distB="0" distL="114300" distR="114300" simplePos="0" relativeHeight="251660288" behindDoc="0" locked="0" layoutInCell="1" allowOverlap="1" wp14:anchorId="01E214FC" wp14:editId="153B8546">
-            <wp:simplePos x="0" y="0"/>
-            <wp:positionH relativeFrom="margin">
-              <wp:posOffset>635</wp:posOffset>
-            </wp:positionH>
-            <wp:positionV relativeFrom="paragraph">
-              <wp:posOffset>8255</wp:posOffset>
-            </wp:positionV>
-            <wp:extent cx="758190" cy="772160"/>
-            <wp:effectExtent l="0" t="0" r="0" b="0"/>
-            <wp:wrapNone/>
-            <wp:docPr id="179" name="Picture 8"/>
-            <wp:cNvGraphicFramePr>
-              <a:graphicFrameLocks xmlns:a="http://schemas.openxmlformats.org/drawingml/2006/main" noChangeAspect="1"/>
-            </wp:cNvGraphicFramePr>
-            <a:graphic xmlns:a="http://schemas.openxmlformats.org/drawingml/2006/main">
-              <a:graphicData uri="http://schemas.openxmlformats.org/drawingml/2006/picture">
-                <pic:pic xmlns:pic="http://schemas.openxmlformats.org/drawingml/2006/picture">
-                  <pic:nvPicPr>
-                    <pic:cNvPr id="0" name="Picture 8"/>
-                    <pic:cNvPicPr>
-                      <a:picLocks noChangeAspect="1" noChangeArrowheads="1"/>
-                    </pic:cNvPicPr>
-                  </pic:nvPicPr>
-                  <pic:blipFill>
-                    <a:blip r:embed="rId5">
-                      <a:extLst>
-                        <a:ext uri="{28A0092B-C50C-407E-A947-70E740481C1C}">
-                          <a14:useLocalDpi xmlns:a14="http://schemas.microsoft.com/office/drawing/2010/main" val="0"/>
-                        </a:ext>
-                      </a:extLst>
-                    </a:blip>
-                    <a:srcRect/>
-                    <a:stretch>
-                      <a:fillRect/>
-                    </a:stretch>
-                  </pic:blipFill>
-                  <pic:spPr bwMode="auto">
-                    <a:xfrm>
-                      <a:off x="0" y="0"/>
-                      <a:ext cx="758190" cy="772160"/>
-                    </a:xfrm>
-                    <a:prstGeom prst="rect">
-                      <a:avLst/>
-                    </a:prstGeom>
-                    <a:noFill/>
-                    <a:ln>
-                      <a:noFill/>
-                    </a:ln>
-                    <a:effectLst/>
-                  </pic:spPr>
-                </pic:pic>
-              </a:graphicData>
-            </a:graphic>
-            <wp14:sizeRelH relativeFrom="margin">
-              <wp14:pctWidth>0</wp14:pctWidth>
-            </wp14:sizeRelH>
-            <wp14:sizeRelV relativeFrom="margin">
-              <wp14:pctHeight>0</wp14:pctHeight>
-            </wp14:sizeRelV>
-          </wp:anchor>
-        </w:drawing>
-      </w:r>
-      <w:r>
-        <w:rPr>
-          <w:rFonts w:ascii="Arial" w:hAnsi="Arial"/>
-          <w:sz w:val="28"/>
-          <w:szCs w:val="28"/>
-        </w:rPr>
-        <w:t xml:space="preserve">KEMENTERIAN AGAMA REPUBLIK INDONESIA </w:t>
-      </w:r>
-    </w:p>
-    <w:p>
-      <w:pPr>
-        <w:ind w:left="720" w:firstLine="720"/>
-        <w:jc w:val="center"/>
-        <w:rPr>
-          <w:rFonts w:ascii="Arial" w:hAnsi="Arial"/>
-        </w:rPr>
-      </w:pPr>
-      <w:r>
-        <w:rPr>
-          <w:rFonts w:ascii="Arial" w:hAnsi="Arial"/>
-        </w:rPr>
-        <w:t>UNIVERSITAS ISLAM NEGERI (UIN) IMAM BONJOL PADANG</w:t>
-      </w:r>
-    </w:p>
-    <w:p>
-      <w:pPr>
-        <w:ind w:left="720" w:firstLine="720"/>
-        <w:jc w:val="center"/>
-        <w:rPr>
-          <w:rFonts w:ascii="Arial" w:hAnsi="Arial"/>
-        </w:rPr>
-      </w:pPr>
-      <w:r>
-        <w:rPr>
-          <w:rFonts w:ascii="Arial" w:hAnsi="Arial"/>
-        </w:rPr>
-        <w:t>FAKULTAS SAINS DAN TEKNOLOGI</w:t>
-      </w:r>
-    </w:p>
-    <w:p>
-      <w:pPr>
-        <w:ind w:left="720" w:firstLine="720"/>
-        <w:jc w:val="center"/>
-        <w:rPr>
-          <w:rFonts w:ascii="Arial" w:hAnsi="Arial"/>
-          <w:sz w:val="16"/>
-          <w:szCs w:val="16"/>
-        </w:rPr>
-      </w:pPr>
-      <w:r>
-        <w:rPr>
-          <w:rFonts w:ascii="Arial" w:hAnsi="Arial"/>
-          <w:sz w:val="16"/>
-          <w:szCs w:val="16"/>
-        </w:rPr>
-        <w:t xml:space="preserve">Alamat: Sungai </w:t>
-      </w:r>
-      <w:proofErr w:type="spellStart"/>
-      <w:r>
-        <w:rPr>
-          <w:rFonts w:ascii="Arial" w:hAnsi="Arial"/>
-          <w:sz w:val="16"/>
-          <w:szCs w:val="16"/>
-        </w:rPr>
-        <w:t>Bangek</w:t>
-      </w:r>
-      <w:proofErr w:type="spellEnd"/>
-      <w:r>
-        <w:rPr>
-          <w:rFonts w:ascii="Arial" w:hAnsi="Arial"/>
-          <w:sz w:val="16"/>
-          <w:szCs w:val="16"/>
-        </w:rPr>
-        <w:t xml:space="preserve"> Kelurahan Balai </w:t>
-      </w:r>
-      <w:proofErr w:type="spellStart"/>
-      <w:r>
-        <w:rPr>
-          <w:rFonts w:ascii="Arial" w:hAnsi="Arial"/>
-          <w:sz w:val="16"/>
-          <w:szCs w:val="16"/>
-        </w:rPr>
-        <w:t>Gadang</w:t>
-      </w:r>
-      <w:proofErr w:type="spellEnd"/>
-      <w:r>
-        <w:rPr>
-          <w:rFonts w:ascii="Arial" w:hAnsi="Arial"/>
-          <w:sz w:val="16"/>
-          <w:szCs w:val="16"/>
-        </w:rPr>
-        <w:t xml:space="preserve"> Kecamatan Koto </w:t>
-      </w:r>
-      <w:proofErr w:type="spellStart"/>
-      <w:r>
-        <w:rPr>
-          <w:rFonts w:ascii="Arial" w:hAnsi="Arial"/>
-          <w:sz w:val="16"/>
-          <w:szCs w:val="16"/>
-        </w:rPr>
-        <w:t>Tangah</w:t>
-      </w:r>
-      <w:proofErr w:type="spellEnd"/>
-      <w:r>
-        <w:rPr>
-          <w:rFonts w:ascii="Arial" w:hAnsi="Arial"/>
-          <w:sz w:val="16"/>
-          <w:szCs w:val="16"/>
-        </w:rPr>
-        <w:t xml:space="preserve"> Kota Padang</w:t>
-      </w:r>
-    </w:p>
-    <w:p>
-      <w:pPr>
-        <w:ind w:left="720" w:firstLine="720"/>
-        <w:jc w:val="center"/>
-        <w:rPr>
-          <w:rFonts w:ascii="Arial" w:hAnsi="Arial"/>
-          <w:sz w:val="16"/>
-          <w:szCs w:val="16"/>
-        </w:rPr>
-      </w:pPr>
-      <w:r>
-        <w:rPr>
-          <w:rFonts w:ascii="Arial" w:hAnsi="Arial"/>
-          <w:sz w:val="16"/>
-          <w:szCs w:val="16"/>
-        </w:rPr>
-        <w:t xml:space="preserve">Website: </w:t>
-      </w:r>
-      <w:hyperlink r:id="rId8" w:history="1">
-        <w:r>
-          <w:rPr>
-            <w:rFonts w:ascii="Arial" w:hAnsi="Arial"/>
-            <w:color w:val="0000FF"/>
-            <w:sz w:val="16"/>
-            <w:szCs w:val="16"/>
-            <w:u w:val="single"/>
-          </w:rPr>
-          <w:t>https://saintek.uinib.ac.id</w:t>
-        </w:r>
-      </w:hyperlink>
-      <w:r>
-        <w:rPr>
-          <w:rFonts w:ascii="Arial" w:hAnsi="Arial"/>
-          <w:sz w:val="16"/>
-          <w:szCs w:val="16"/>
-        </w:rPr>
-        <w:t xml:space="preserve"> – e-mail: </w:t>
-      </w:r>
-      <w:hyperlink r:id="rId9" w:history="1">
-        <w:r>
-          <w:rPr>
-            <w:rFonts w:ascii="Arial" w:hAnsi="Arial"/>
-            <w:color w:val="0000FF"/>
-            <w:sz w:val="16"/>
-            <w:szCs w:val="16"/>
-            <w:u w:val="single"/>
-          </w:rPr>
-          <w:t>admin-fst@uinib.ac.id</w:t>
-        </w:r>
-      </w:hyperlink>
-    </w:p>
-    <w:p>
-      <w:pPr>
-        <w:tabs>
-          <w:tab w:val="center" w:pos="4513"/>
-          <w:tab w:val="right" w:pos="9026"/>
-        </w:tabs>
-        <w:rPr>
-          <w:rFonts w:ascii="Arial" w:hAnsi="Arial" w:cs="Arial"/>
-          <w:b/>
-          <w:u w:val="single"/>
-        </w:rPr>
-      </w:pPr>
-      <w:r>
-        <w:rPr>
-          <w:noProof/>
-        </w:rPr>
-        <mc:AlternateContent>
-          <mc:Choice Requires="wps">
-            <w:drawing>
-              <wp:anchor distT="0" distB="0" distL="114300" distR="114300" simplePos="0" relativeHeight="251661312" behindDoc="0" locked="0" layoutInCell="1" allowOverlap="1" wp14:anchorId="594BBED8" wp14:editId="6C4805F3">
-                <wp:simplePos x="0" y="0"/>
-                <wp:positionH relativeFrom="margin">
-                  <wp:posOffset>-81280</wp:posOffset>
-                </wp:positionH>
-                <wp:positionV relativeFrom="paragraph">
-                  <wp:posOffset>68580</wp:posOffset>
-                </wp:positionV>
-                <wp:extent cx="5911215" cy="11430"/>
-                <wp:effectExtent l="19050" t="19050" r="13335" b="7620"/>
-                <wp:wrapNone/>
-                <wp:docPr id="10" name="Straight Connector 2"/>
-                <wp:cNvGraphicFramePr>
-                  <a:graphicFrameLocks xmlns:a="http://schemas.openxmlformats.org/drawingml/2006/main"/>
-                </wp:cNvGraphicFramePr>
-                <a:graphic xmlns:a="http://schemas.openxmlformats.org/drawingml/2006/main">
-                  <a:graphicData uri="http://schemas.microsoft.com/office/word/2010/wordprocessingShape">
-                    <wps:wsp>
-                      <wps:cNvCnPr>
-                        <a:cxnSpLocks/>
-                      </wps:cNvCnPr>
-                      <wps:spPr>
-                        <a:xfrm>
-                          <a:off x="0" y="0"/>
-                          <a:ext cx="5911215" cy="11430"/>
-                        </a:xfrm>
-                        <a:prstGeom prst="line">
-                          <a:avLst/>
-                        </a:prstGeom>
-                        <a:noFill/>
-                        <a:ln w="44450" cap="flat" cmpd="thickThin" algn="ctr">
-                          <a:solidFill>
-                            <a:sysClr val="windowText" lastClr="000000"/>
-                          </a:solidFill>
-                          <a:prstDash val="solid"/>
-                          <a:miter lim="800000"/>
-                        </a:ln>
-                        <a:effectLst/>
-                      </wps:spPr>
-                      <wps:bodyPr/>
-                    </wps:wsp>
-                  </a:graphicData>
-                </a:graphic>
-                <wp14:sizeRelH relativeFrom="page">
-                  <wp14:pctWidth>0</wp14:pctWidth>
-                </wp14:sizeRelH>
-                <wp14:sizeRelV relativeFrom="page">
-                  <wp14:pctHeight>0</wp14:pctHeight>
-                </wp14:sizeRelV>
-              </wp:anchor>
-            </w:drawing>
-          </mc:Choice>
-          <mc:Fallback>
-            <w:pict>
-              <v:line w14:anchorId="74ACDC02" id="Straight Connector 2" o:spid="_x0000_s1026" style="position:absolute;z-index:251661312;visibility:visible;mso-wrap-style:square;mso-width-percent:0;mso-height-percent:0;mso-wrap-distance-left:9pt;mso-wrap-distance-top:0;mso-wrap-distance-right:9pt;mso-wrap-distance-bottom:0;mso-position-horizontal:absolute;mso-position-horizontal-relative:margin;mso-position-vertical:absolute;mso-position-vertical-relative:text;mso-width-percent:0;mso-height-percent:0;mso-width-relative:page;mso-height-relative:page" from="-6.4pt,5.4pt" to="459.05pt,6.3pt" o:gfxdata="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" strokecolor="windowText" strokeweight="3.5pt">
-                <v:stroke linestyle="thickThin" joinstyle="miter"/>
-                <o:lock v:ext="edit" shapetype="f"/>
-                <w10:wrap anchorx="margin"/>
-              </v:line>
-            </w:pict>
-          </mc:Fallback>
-        </mc:AlternateContent>
-      </w:r>
-    </w:p>
-    <w:p>
-      <w:pPr>
-        <w:jc w:val="center"/>
-        <w:rPr>
-          <w:rFonts w:ascii="Arial" w:hAnsi="Arial" w:cs="Arial"/>
-          <w:b/>
-          <w:u w:val="single"/>
-        </w:rPr>
-      </w:pPr>
-    </w:p>
-    <w:p>
-      <w:pPr>
-        <w:jc w:val="center"/>
-        <w:rPr>
-          <w:rFonts w:ascii="Arial" w:hAnsi="Arial" w:cs="Arial"/>
-          <w:b/>
-          <w:u w:val="single"/>
-          <w:lang w:val="id-ID"/>
-        </w:rPr>
-      </w:pPr>
-      <w:r>
-        <w:rPr>
-          <w:rFonts w:ascii="Arial" w:hAnsi="Arial" w:cs="Arial"/>
-          <w:b/>
-          <w:u w:val="single"/>
-        </w:rPr>
-        <w:t>SURAT TUGAS</w:t>
-      </w:r>
-    </w:p>
-    <w:p>
-      <w:pPr>
-        <w:spacing w:line="260" w:lineRule="exact"/>
-        <w:jc w:val="center"/>
-        <w:rPr>
-          <w:rFonts w:ascii="Arial" w:hAnsi="Arial" w:cs="Arial"/>
-        </w:rPr>
-      </w:pPr>
-      <w:proofErr w:type="gramStart"/>
-      <w:r>
-        <w:rPr>
-          <w:rFonts w:ascii="Arial" w:hAnsi="Arial" w:cs="Arial"/>
-          <w:lang w:val="en-GB"/>
-        </w:rPr>
-        <w:t>N</w:t>
-      </w:r>
-      <w:proofErr w:type="spellStart"/>
-      <w:r>
-        <w:rPr>
-          <w:rFonts w:ascii="Arial" w:hAnsi="Arial" w:cs="Arial"/>
-        </w:rPr>
-        <w:t>omor</w:t>
-      </w:r>
-      <w:proofErr w:type="spellEnd"/>
-      <w:r>
-        <w:rPr>
-          <w:rFonts w:ascii="Arial" w:hAnsi="Arial" w:cs="Arial"/>
-          <w:lang w:val="en-GB"/>
-        </w:rPr>
-        <w:t xml:space="preserve"> :</w:t>
-      </w:r>
-      <w:proofErr w:type="gramEnd"/>
-      <w:r>
-        <w:rPr>
-          <w:rFonts w:ascii="Arial" w:hAnsi="Arial" w:cs="Arial"/>
-          <w:lang w:val="en-GB"/>
-        </w:rPr>
-        <w:t xml:space="preserve"> </w:t>
-      </w:r>
-      <w:r>
-        <w:rPr>
-          <w:rFonts w:ascii="Arial" w:hAnsi="Arial" w:cs="Arial"/>
-          <w:lang w:val="en-GB"/>
-        </w:rPr>
-        <w:t>{</w:t>
-      </w:r>
-      <w:proofErr w:type="spellStart"/>
-      <w:r>
-        <w:rPr>
-          <w:rFonts w:ascii="Arial" w:hAnsi="Arial" w:cs="Arial"/>
-          <w:lang w:val="en-GB"/>
-        </w:rPr>
-        <w:t>nomor</w:t>
-      </w:r>
-      <w:proofErr w:type="spellEnd"/>
-      <w:r>
-        <w:rPr>
-          <w:rFonts w:ascii="Arial" w:hAnsi="Arial" w:cs="Arial"/>
-          <w:lang w:val="en-GB"/>
-        </w:rPr>
-        <w:t>}</w:t>
-      </w:r>
-    </w:p>
-    <w:p>
-      <w:pPr>
-        <w:spacing w:line="260" w:lineRule="exact"/>
-        <w:jc w:val="both"/>
-        <w:rPr>
-          <w:rFonts w:ascii="Arial" w:hAnsi="Arial" w:cs="Arial"/>
-        </w:rPr>
-      </w:pPr>
-    </w:p>
-    <w:p>
-      <w:pPr>
-        <w:spacing w:line="260" w:lineRule="exact"/>
-        <w:jc w:val="center"/>
-        <w:rPr>
-          <w:rFonts w:ascii="Arial" w:hAnsi="Arial" w:cs="Arial"/>
-          <w:b/>
-          <w:bCs/>
-        </w:rPr>
-      </w:pPr>
-      <w:r>
-        <w:rPr>
-          <w:rFonts w:ascii="Arial" w:hAnsi="Arial" w:cs="Arial"/>
-          <w:b/>
-          <w:bCs/>
-        </w:rPr>
-        <w:t>DEKAN FAKULTAS SAINS DAN TEKNOLOGI</w:t>
-      </w:r>
-    </w:p>
-    <w:p>
-      <w:pPr>
-        <w:spacing w:line="260" w:lineRule="exact"/>
-        <w:jc w:val="center"/>
-        <w:rPr>
-          <w:rFonts w:ascii="Arial" w:hAnsi="Arial" w:cs="Arial"/>
-        </w:rPr>
-      </w:pPr>
-    </w:p>
-    <w:tbl>
-      <w:tblPr>
-        <w:tblW w:w="0" w:type="auto"/>
-        <w:tblLayout w:type="fixed"/>
-        <w:tblLook w:val="0000" w:firstRow="0" w:lastRow="0" w:firstColumn="0" w:lastColumn="0" w:noHBand="0" w:noVBand="0"/>
-      </w:tblPr>
-      <w:tblGrid>
-        <w:gridCol w:w="1547"/>
-        <w:gridCol w:w="240"/>
-        <w:gridCol w:w="433"/>
-        <w:gridCol w:w="7141"/>
-      </w:tblGrid>
-      <w:tr>
-        <w:trPr>
-          <w:trHeight w:val="909"/>
-        </w:trPr>
-        <w:tc>
-          <w:tcPr>
-            <w:tcW w:w="1547" w:type="dxa"/>
-          </w:tcPr>
-          <w:p>
-            <w:pPr>
-              <w:spacing w:line="260" w:lineRule="exact"/>
-              <w:rPr>
-                <w:rFonts w:ascii="Arial" w:hAnsi="Arial" w:cs="Arial"/>
-                <w:lang w:val="id-ID"/>
-              </w:rPr>
-            </w:pPr>
-            <w:proofErr w:type="spellStart"/>
-            <w:r>
-              <w:rPr>
-                <w:rFonts w:ascii="Arial" w:hAnsi="Arial" w:cs="Arial"/>
-              </w:rPr>
-              <w:t>Menimbang</w:t>
-            </w:r>
-            <w:proofErr w:type="spellEnd"/>
-          </w:p>
-        </w:tc>
-        <w:tc>
-          <w:tcPr>
-            <w:tcW w:w="240" w:type="dxa"/>
-          </w:tcPr>
-          <w:p>
-            <w:pPr>
-              <w:spacing w:line="260" w:lineRule="exact"/>
-              <w:jc w:val="center"/>
-              <w:rPr>
-                <w:rFonts w:ascii="Arial" w:hAnsi="Arial" w:cs="Arial"/>
-              </w:rPr>
-            </w:pPr>
-            <w:r>
-              <w:rPr>
-                <w:rFonts w:ascii="Arial" w:hAnsi="Arial" w:cs="Arial"/>
-              </w:rPr>
-              <w:t>:</w:t>
-            </w:r>
-          </w:p>
-        </w:tc>
-        <w:tc>
-          <w:tcPr>
-            <w:tcW w:w="433" w:type="dxa"/>
-          </w:tcPr>
-          <w:p>
-            <w:pPr>
-              <w:spacing w:line="260" w:lineRule="exact"/>
-              <w:jc w:val="center"/>
-              <w:rPr>
-                <w:rFonts w:ascii="Arial" w:hAnsi="Arial" w:cs="Arial"/>
-              </w:rPr>
-            </w:pPr>
-            <w:r>
-              <w:rPr>
-                <w:rFonts w:ascii="Arial" w:hAnsi="Arial" w:cs="Arial"/>
-              </w:rPr>
-              <w:t>a.</w:t>
-            </w:r>
-          </w:p>
-          <w:p>
-            <w:pPr>
-              <w:spacing w:line="260" w:lineRule="exact"/>
-              <w:jc w:val="both"/>
-              <w:rPr>
-                <w:rFonts w:ascii="Arial" w:hAnsi="Arial" w:cs="Arial"/>
-              </w:rPr>
-            </w:pPr>
-          </w:p>
-          <w:p>
-            <w:pPr>
-              <w:spacing w:line="260" w:lineRule="exact"/>
-              <w:jc w:val="both"/>
-              <w:rPr>
-                <w:rFonts w:ascii="Arial" w:hAnsi="Arial" w:cs="Arial"/>
-              </w:rPr>
-            </w:pPr>
-          </w:p>
-        </w:tc>
-        <w:tc>
-          <w:tcPr>
-            <w:tcW w:w="7141" w:type="dxa"/>
-          </w:tcPr>
-          <w:p>
-            <w:pPr>
-              <w:jc w:val="both"/>
-              <w:rPr>
-                <w:rFonts w:ascii="Arial" w:hAnsi="Arial" w:cs="Arial"/>
-              </w:rPr>
-            </w:pPr>
-            <w:r>
-              <w:rPr>
-                <w:rFonts w:ascii="Arial" w:hAnsi="Arial" w:cs="Arial"/>
-                <w:lang w:val="id-ID"/>
-              </w:rPr>
-              <w:t xml:space="preserve">bahwa sehubungan dengan </w:t>
-            </w:r>
-            <w:proofErr w:type="spellStart"/>
-            <w:r>
-              <w:rPr>
-                <w:rFonts w:ascii="Arial" w:hAnsi="Arial" w:cs="Arial"/>
-              </w:rPr>
-              <w:t>kegiatan</w:t>
-            </w:r>
-            <w:proofErr w:type="spellEnd"/>
-            <w:r>
-              <w:rPr>
-                <w:rFonts w:ascii="Arial" w:hAnsi="Arial" w:cs="Arial"/>
-              </w:rPr>
-              <w:t xml:space="preserve"> {</w:t>
-            </w:r>
-            <w:proofErr w:type="spellStart"/>
-            <w:r>
-              <w:rPr>
-                <w:rFonts w:ascii="Arial" w:hAnsi="Arial" w:cs="Arial"/>
-              </w:rPr>
-              <w:t>menimbang_kegiatan</w:t>
-            </w:r>
-            <w:proofErr w:type="spellEnd"/>
-            <w:r>
-              <w:rPr>
-                <w:rFonts w:ascii="Arial" w:hAnsi="Arial" w:cs="Arial"/>
-              </w:rPr>
-              <w:t>}</w:t>
-            </w:r>
-            <w:r>
-              <w:rPr>
-                <w:rFonts w:ascii="Arial" w:hAnsi="Arial" w:cs="Arial"/>
-              </w:rPr>
-              <w:t xml:space="preserve">, </w:t>
-            </w:r>
-            <w:r>
-              <w:rPr>
-                <w:rFonts w:ascii="Arial" w:hAnsi="Arial" w:cs="Arial"/>
-                <w:lang w:val="id-ID"/>
-              </w:rPr>
-              <w:t xml:space="preserve">maka perlu diutus pihak terkait untuk </w:t>
-            </w:r>
-            <w:proofErr w:type="spellStart"/>
-            <w:r>
-              <w:rPr>
-                <w:rFonts w:ascii="Arial" w:hAnsi="Arial" w:cs="Arial"/>
-              </w:rPr>
-              <w:t>kegiatan</w:t>
-            </w:r>
-            <w:proofErr w:type="spellEnd"/>
-            <w:r>
-              <w:rPr>
-                <w:rFonts w:ascii="Arial" w:hAnsi="Arial" w:cs="Arial"/>
-                <w:lang w:val="id-ID"/>
-              </w:rPr>
-              <w:t xml:space="preserve"> tersebut</w:t>
-            </w:r>
-            <w:r>
-              <w:rPr>
-                <w:rFonts w:ascii="Arial" w:hAnsi="Arial" w:cs="Arial"/>
-              </w:rPr>
-              <w:t>;</w:t>
-            </w:r>
-          </w:p>
-        </w:tc>
-      </w:tr>
-      <w:tr>
-        <w:tc>
-          <w:tcPr>
-            <w:tcW w:w="1547" w:type="dxa"/>
-          </w:tcPr>
-          <w:p>
-            <w:pPr>
-              <w:spacing w:line="260" w:lineRule="exact"/>
-              <w:jc w:val="center"/>
-              <w:rPr>
-                <w:rFonts w:ascii="Arial" w:hAnsi="Arial" w:cs="Arial"/>
-                <w:lang w:val="id-ID"/>
-              </w:rPr>
-            </w:pPr>
-          </w:p>
-        </w:tc>
-        <w:tc>
-          <w:tcPr>
-            <w:tcW w:w="240" w:type="dxa"/>
-          </w:tcPr>
-          <w:p>
-            <w:pPr>
-              <w:spacing w:line="260" w:lineRule="exact"/>
-              <w:jc w:val="center"/>
-              <w:rPr>
-                <w:rFonts w:ascii="Arial" w:hAnsi="Arial" w:cs="Arial"/>
-                <w:lang w:val="id-ID"/>
-              </w:rPr>
-            </w:pPr>
-          </w:p>
-        </w:tc>
-        <w:tc>
-          <w:tcPr>
-            <w:tcW w:w="433" w:type="dxa"/>
-          </w:tcPr>
-          <w:p>
-            <w:pPr>
-              <w:spacing w:line="260" w:lineRule="exact"/>
-              <w:jc w:val="center"/>
-              <w:rPr>
-                <w:rFonts w:ascii="Arial" w:hAnsi="Arial" w:cs="Arial"/>
-              </w:rPr>
-            </w:pPr>
-            <w:r>
-              <w:rPr>
-                <w:rFonts w:ascii="Arial" w:hAnsi="Arial" w:cs="Arial"/>
-              </w:rPr>
-              <w:t>b.</w:t>
-            </w:r>
-          </w:p>
-        </w:tc>
-        <w:tc>
-          <w:tcPr>
-            <w:tcW w:w="7141" w:type="dxa"/>
-          </w:tcPr>
-          <w:p>
-            <w:pPr>
-              <w:jc w:val="both"/>
-              <w:rPr>
-                <w:rFonts w:ascii="Arial" w:hAnsi="Arial" w:cs="Arial"/>
-              </w:rPr>
-            </w:pPr>
-            <w:r>
-              <w:rPr>
-                <w:rFonts w:ascii="Arial" w:hAnsi="Arial" w:cs="Arial"/>
-                <w:lang w:val="id-ID"/>
-              </w:rPr>
-              <w:t>bahwa Saudara yang namanya tersebut di bawah ini dipandang cakap dan memenuhi syarat untu</w:t>
-            </w:r>
-            <w:r>
-              <w:rPr>
-                <w:rFonts w:ascii="Arial" w:hAnsi="Arial" w:cs="Arial"/>
-              </w:rPr>
-              <w:t xml:space="preserve">k </w:t>
-            </w:r>
-            <w:r>
-              <w:rPr>
-                <w:rFonts w:ascii="Arial" w:hAnsi="Arial" w:cs="Arial"/>
-                <w:lang w:val="id-ID"/>
-              </w:rPr>
-              <w:t xml:space="preserve">kegiatan </w:t>
-            </w:r>
-            <w:proofErr w:type="spellStart"/>
-            <w:r>
-              <w:rPr>
-                <w:rFonts w:ascii="Arial" w:hAnsi="Arial" w:cs="Arial"/>
-              </w:rPr>
-              <w:t>ters</w:t>
-            </w:r>
-            <w:proofErr w:type="spellEnd"/>
-            <w:r>
-              <w:rPr>
-                <w:rFonts w:ascii="Arial" w:hAnsi="Arial" w:cs="Arial"/>
-                <w:lang w:val="id-ID"/>
-              </w:rPr>
-              <w:t>ebut</w:t>
-            </w:r>
-            <w:r>
-              <w:rPr>
-                <w:rFonts w:ascii="Arial" w:hAnsi="Arial" w:cs="Arial"/>
-              </w:rPr>
-              <w:t>.</w:t>
-            </w:r>
-          </w:p>
-          <w:p>
-            <w:pPr>
-              <w:tabs>
-                <w:tab w:val="left" w:pos="1418"/>
-              </w:tabs>
-              <w:jc w:val="both"/>
-              <w:rPr>
-                <w:rFonts w:ascii="Arial" w:hAnsi="Arial" w:cs="Arial"/>
-              </w:rPr>
-            </w:pPr>
-          </w:p>
-        </w:tc>
-      </w:tr>
-      <w:tr>
-        <w:tc>
-          <w:tcPr>
-            <w:tcW w:w="1547" w:type="dxa"/>
-          </w:tcPr>
-          <w:p>
-            <w:pPr>
-              <w:spacing w:line="260" w:lineRule="exact"/>
-              <w:rPr>
-                <w:rFonts w:ascii="Arial" w:hAnsi="Arial" w:cs="Arial"/>
-                <w:lang w:val="id-ID"/>
-              </w:rPr>
-            </w:pPr>
-            <w:r>
-              <w:rPr>
-                <w:rFonts w:ascii="Arial" w:hAnsi="Arial" w:cs="Arial"/>
-              </w:rPr>
-              <w:t>Dasar</w:t>
-            </w:r>
-          </w:p>
-        </w:tc>
-        <w:tc>
-          <w:tcPr>
-            <w:tcW w:w="240" w:type="dxa"/>
-          </w:tcPr>
-          <w:p>
-            <w:pPr>
-              <w:spacing w:line="260" w:lineRule="exact"/>
-              <w:jc w:val="center"/>
-              <w:rPr>
-                <w:rFonts w:ascii="Arial" w:hAnsi="Arial" w:cs="Arial"/>
-              </w:rPr>
-            </w:pPr>
-            <w:r>
-              <w:rPr>
-                <w:rFonts w:ascii="Arial" w:hAnsi="Arial" w:cs="Arial"/>
-              </w:rPr>
-              <w:t>:</w:t>
-            </w:r>
-          </w:p>
-        </w:tc>
-        <w:tc>
-          <w:tcPr>
-            <w:tcW w:w="433" w:type="dxa"/>
-          </w:tcPr>
-          <w:p>
-            <w:pPr>
-              <w:spacing w:line="260" w:lineRule="exact"/>
-              <w:jc w:val="center"/>
-              <w:rPr>
-                <w:rFonts w:ascii="Arial" w:hAnsi="Arial" w:cs="Arial"/>
-              </w:rPr>
-            </w:pPr>
-            <w:r>
-              <w:rPr>
-                <w:rFonts w:ascii="Arial" w:hAnsi="Arial" w:cs="Arial"/>
-              </w:rPr>
-              <w:t>1.</w:t>
-            </w:r>
-          </w:p>
-        </w:tc>
-        <w:tc>
-          <w:tcPr>
-            <w:tcW w:w="7141" w:type="dxa"/>
-          </w:tcPr>
-          <w:p>
-            <w:pPr>
-              <w:tabs>
-                <w:tab w:val="left" w:pos="1418"/>
-              </w:tabs>
-              <w:spacing w:line="260" w:lineRule="exact"/>
-              <w:jc w:val="both"/>
-              <w:rPr>
-                <w:rFonts w:ascii="Arial" w:hAnsi="Arial" w:cs="Arial"/>
-                <w:lang w:val="id-ID"/>
-              </w:rPr>
-            </w:pPr>
-            <w:r>
-              <w:rPr>
-                <w:rFonts w:ascii="Arial" w:hAnsi="Arial" w:cs="Arial"/>
-                <w:lang w:val="id-ID"/>
-              </w:rPr>
-              <w:t>KMA RI No.9 Tahun 2016 tentang Pedoman Tata Naskah Dinas</w:t>
-            </w:r>
-            <w:r>
-              <w:rPr>
-                <w:rFonts w:ascii="Arial" w:hAnsi="Arial" w:cs="Arial"/>
-              </w:rPr>
-              <w:t xml:space="preserve"> </w:t>
-            </w:r>
-            <w:r>
-              <w:rPr>
-                <w:rFonts w:ascii="Arial" w:hAnsi="Arial" w:cs="Arial"/>
-                <w:lang w:val="id-ID"/>
-              </w:rPr>
-              <w:t>pada Kementerian Agama RI;</w:t>
-            </w:r>
-          </w:p>
-        </w:tc>
-      </w:tr>
-      <w:tr>
-        <w:tc>
-          <w:tcPr>
-            <w:tcW w:w="1547" w:type="dxa"/>
-          </w:tcPr>
-          <w:p>
-            <w:pPr>
-              <w:spacing w:line="260" w:lineRule="exact"/>
-              <w:jc w:val="center"/>
-              <w:rPr>
-                <w:rFonts w:ascii="Arial" w:hAnsi="Arial" w:cs="Arial"/>
-              </w:rPr>
-            </w:pPr>
-          </w:p>
-        </w:tc>
-        <w:tc>
-          <w:tcPr>
-            <w:tcW w:w="240" w:type="dxa"/>
-          </w:tcPr>
-          <w:p>
-            <w:pPr>
-              <w:spacing w:line="260" w:lineRule="exact"/>
-              <w:jc w:val="center"/>
-              <w:rPr>
-                <w:rFonts w:ascii="Arial" w:hAnsi="Arial" w:cs="Arial"/>
-                <w:lang w:val="id-ID"/>
-              </w:rPr>
-            </w:pPr>
-          </w:p>
-        </w:tc>
-        <w:tc>
-          <w:tcPr>
-            <w:tcW w:w="433" w:type="dxa"/>
-          </w:tcPr>
-          <w:p>
-            <w:pPr>
-              <w:spacing w:line="260" w:lineRule="exact"/>
-              <w:jc w:val="center"/>
-              <w:rPr>
-                <w:rFonts w:ascii="Arial" w:hAnsi="Arial" w:cs="Arial"/>
-              </w:rPr>
-            </w:pPr>
-            <w:r>
-              <w:rPr>
-                <w:rFonts w:ascii="Arial" w:hAnsi="Arial" w:cs="Arial"/>
-              </w:rPr>
-              <w:t>2.</w:t>
-            </w:r>
-          </w:p>
-        </w:tc>
-        <w:tc>
-          <w:tcPr>
-            <w:tcW w:w="7141" w:type="dxa"/>
-          </w:tcPr>
-          <w:p>
-            <w:pPr>
-              <w:spacing w:line="260" w:lineRule="exact"/>
-              <w:jc w:val="both"/>
-              <w:rPr>
-                <w:rFonts w:ascii="Arial" w:hAnsi="Arial" w:cs="Arial"/>
-              </w:rPr>
-            </w:pPr>
-            <w:r>
-              <w:rPr>
-                <w:rFonts w:ascii="Arial" w:hAnsi="Arial" w:cs="Arial"/>
-                <w:lang w:val="id-ID"/>
-              </w:rPr>
-              <w:t xml:space="preserve">Peraturan Menteri Agama RI Nomor 6 Tahun 2018 tanggal 21  Februari 2018 tentang Perjalanan Dinas Pada Kementerian </w:t>
-            </w:r>
-            <w:r>
-              <w:rPr>
-                <w:rFonts w:ascii="Arial" w:hAnsi="Arial" w:cs="Arial"/>
-              </w:rPr>
-              <w:t xml:space="preserve">   </w:t>
-            </w:r>
-            <w:r>
-              <w:rPr>
-                <w:rFonts w:ascii="Arial" w:hAnsi="Arial" w:cs="Arial"/>
-                <w:lang w:val="id-ID"/>
-              </w:rPr>
-              <w:t>Agama</w:t>
-            </w:r>
-            <w:r>
-              <w:rPr>
-                <w:rFonts w:ascii="Arial" w:hAnsi="Arial" w:cs="Arial"/>
-              </w:rPr>
-              <w:t>;</w:t>
-            </w:r>
-          </w:p>
-        </w:tc>
-      </w:tr>
-      <w:tr>
-        <w:tc>
-          <w:tcPr>
-            <w:tcW w:w="1547" w:type="dxa"/>
-          </w:tcPr>
-          <w:p>
-            <w:pPr>
-              <w:spacing w:line="260" w:lineRule="exact"/>
-              <w:jc w:val="center"/>
-              <w:rPr>
-                <w:rFonts w:ascii="Arial" w:hAnsi="Arial" w:cs="Arial"/>
-              </w:rPr>
-            </w:pPr>
-          </w:p>
-        </w:tc>
-        <w:tc>
-          <w:tcPr>
-            <w:tcW w:w="240" w:type="dxa"/>
-          </w:tcPr>
-          <w:p>
-            <w:pPr>
-              <w:spacing w:line="260" w:lineRule="exact"/>
-              <w:jc w:val="center"/>
-              <w:rPr>
-                <w:rFonts w:ascii="Arial" w:hAnsi="Arial" w:cs="Arial"/>
-                <w:lang w:val="id-ID"/>
-              </w:rPr>
-            </w:pPr>
-          </w:p>
-        </w:tc>
-        <w:tc>
-          <w:tcPr>
-            <w:tcW w:w="433" w:type="dxa"/>
-          </w:tcPr>
-          <w:p>
-            <w:pPr>
-              <w:spacing w:line="260" w:lineRule="exact"/>
-              <w:jc w:val="center"/>
-              <w:rPr>
-                <w:rFonts w:ascii="Arial" w:hAnsi="Arial" w:cs="Arial"/>
-              </w:rPr>
-            </w:pPr>
-            <w:r>
-              <w:rPr>
-                <w:rFonts w:ascii="Arial" w:hAnsi="Arial" w:cs="Arial"/>
-              </w:rPr>
-              <w:t>3.</w:t>
-            </w:r>
-          </w:p>
-        </w:tc>
-        <w:tc>
-          <w:tcPr>
-            <w:tcW w:w="7141" w:type="dxa"/>
-          </w:tcPr>
-          <w:p>
-            <w:pPr>
-              <w:spacing w:line="260" w:lineRule="exact"/>
-              <w:jc w:val="both"/>
-              <w:rPr>
-                <w:rFonts w:ascii="Arial" w:hAnsi="Arial" w:cs="Arial"/>
-              </w:rPr>
-            </w:pPr>
-            <w:r>
-              <w:rPr>
-                <w:rFonts w:ascii="Arial" w:hAnsi="Arial" w:cs="Arial"/>
-                <w:lang w:val="id-ID"/>
-              </w:rPr>
-              <w:t>Permendikbud Nomor 3 Tahun 2020 tentang Standar PTKI pada Standar Proses Pembelajaran</w:t>
-            </w:r>
-            <w:r>
-              <w:rPr>
-                <w:rFonts w:ascii="Arial" w:hAnsi="Arial" w:cs="Arial"/>
-              </w:rPr>
-              <w:t>;</w:t>
-            </w:r>
-          </w:p>
-        </w:tc>
-      </w:tr>
-      <w:tr>
-        <w:tc>
-          <w:tcPr>
-            <w:tcW w:w="1547" w:type="dxa"/>
-          </w:tcPr>
-          <w:p>
-            <w:pPr>
-              <w:spacing w:line="260" w:lineRule="exact"/>
-              <w:jc w:val="center"/>
-              <w:rPr>
-                <w:rFonts w:ascii="Arial" w:hAnsi="Arial" w:cs="Arial"/>
-              </w:rPr>
-            </w:pPr>
-          </w:p>
-        </w:tc>
-        <w:tc>
-          <w:tcPr>
-            <w:tcW w:w="240" w:type="dxa"/>
-          </w:tcPr>
-          <w:p>
-            <w:pPr>
-              <w:spacing w:line="260" w:lineRule="exact"/>
-              <w:jc w:val="center"/>
-              <w:rPr>
-                <w:rFonts w:ascii="Arial" w:hAnsi="Arial" w:cs="Arial"/>
-                <w:lang w:val="id-ID"/>
-              </w:rPr>
-            </w:pPr>
-          </w:p>
-        </w:tc>
-        <w:tc>
-          <w:tcPr>
-            <w:tcW w:w="433" w:type="dxa"/>
-          </w:tcPr>
-          <w:p>
-            <w:pPr>
-              <w:spacing w:line="260" w:lineRule="exact"/>
-              <w:jc w:val="center"/>
-              <w:rPr>
-                <w:rFonts w:ascii="Arial" w:hAnsi="Arial" w:cs="Arial"/>
-              </w:rPr>
-            </w:pPr>
-            <w:r>
-              <w:rPr>
-                <w:rFonts w:ascii="Arial" w:hAnsi="Arial" w:cs="Arial"/>
-              </w:rPr>
-              <w:t>4.</w:t>
-            </w:r>
-          </w:p>
-        </w:tc>
-        <w:tc>
-          <w:tcPr>
-            <w:tcW w:w="7141" w:type="dxa"/>
-          </w:tcPr>
-          <w:p>
-            <w:pPr>
-              <w:tabs>
-                <w:tab w:val="left" w:pos="1418"/>
-              </w:tabs>
-              <w:spacing w:line="260" w:lineRule="exact"/>
-              <w:jc w:val="both"/>
-              <w:rPr>
-                <w:rFonts w:ascii="Arial" w:hAnsi="Arial" w:cs="Arial"/>
-              </w:rPr>
-            </w:pPr>
-            <w:r>
-              <w:rPr>
-                <w:rFonts w:ascii="Arial" w:hAnsi="Arial" w:cs="Arial"/>
-                <w:lang w:val="id-ID"/>
-              </w:rPr>
-              <w:t xml:space="preserve">DIPA </w:t>
-            </w:r>
-            <w:r>
-              <w:rPr>
-                <w:rFonts w:ascii="Arial" w:hAnsi="Arial" w:cs="Arial"/>
-                <w:lang w:val="id-ID"/>
-              </w:rPr>
-              <w:t xml:space="preserve">{dasar_dipa} </w:t>
-            </w:r>
-            <w:r>
-              <w:rPr>
-                <w:rFonts w:ascii="Arial" w:hAnsi="Arial" w:cs="Arial"/>
-                <w:lang w:val="id-ID"/>
-              </w:rPr>
-              <w:t xml:space="preserve">tanggal </w:t>
-            </w:r>
-            <w:r>
-              <w:rPr>
-                <w:rFonts w:ascii="Arial" w:hAnsi="Arial" w:cs="Arial"/>
-              </w:rPr>
-              <w:t>{</w:t>
-            </w:r>
-            <w:proofErr w:type="spellStart"/>
-            <w:r>
-              <w:rPr>
-                <w:rFonts w:ascii="Arial" w:hAnsi="Arial" w:cs="Arial"/>
-              </w:rPr>
-              <w:t>dasar_dipa_tanggal</w:t>
-            </w:r>
-            <w:proofErr w:type="spellEnd"/>
-            <w:r>
-              <w:rPr>
-                <w:rFonts w:ascii="Arial" w:hAnsi="Arial" w:cs="Arial"/>
-              </w:rPr>
-              <w:t>}</w:t>
-            </w:r>
-          </w:p>
-        </w:tc>
-      </w:tr>
-    </w:tbl>
-    <w:p>
-      <w:pPr>
-        <w:spacing w:line="260" w:lineRule="exact"/>
-        <w:jc w:val="center"/>
-        <w:rPr>
-          <w:rFonts w:ascii="Arial" w:hAnsi="Arial" w:cs="Arial"/>
-          <w:lang w:val="id-ID"/>
-        </w:rPr>
-      </w:pPr>
-    </w:p>
-    <w:p>
-      <w:pPr>
-        <w:spacing w:line="260" w:lineRule="exact"/>
-        <w:jc w:val="center"/>
-        <w:rPr>
-          <w:rFonts w:ascii="Arial" w:hAnsi="Arial" w:cs="Arial"/>
-        </w:rPr>
-      </w:pPr>
-      <w:proofErr w:type="spellStart"/>
-      <w:r>
-        <w:rPr>
-          <w:rFonts w:ascii="Arial" w:hAnsi="Arial" w:cs="Arial"/>
-          <w:b/>
-          <w:bCs/>
-        </w:rPr>
-        <w:t>Memberi</w:t>
-      </w:r>
-      <w:proofErr w:type="spellEnd"/>
-      <w:r>
-        <w:rPr>
-          <w:rFonts w:ascii="Arial" w:hAnsi="Arial" w:cs="Arial"/>
-          <w:b/>
-          <w:bCs/>
-        </w:rPr>
-        <w:t xml:space="preserve"> </w:t>
-      </w:r>
-      <w:proofErr w:type="spellStart"/>
-      <w:r>
-        <w:rPr>
-          <w:rFonts w:ascii="Arial" w:hAnsi="Arial" w:cs="Arial"/>
-          <w:b/>
-          <w:bCs/>
-        </w:rPr>
-        <w:t>Tugas</w:t>
-      </w:r>
-      <w:proofErr w:type="spellEnd"/>
-    </w:p>
-    <w:p>
-      <w:pPr>
-        <w:spacing w:line="260" w:lineRule="exact"/>
-        <w:jc w:val="both"/>
-        <w:rPr>
-          <w:rFonts w:ascii="Arial" w:hAnsi="Arial" w:cs="Arial"/>
-        </w:rPr>
-      </w:pPr>
-    </w:p>
-    <w:tbl>
-      <w:tblPr>
-        <w:tblW w:w="9365" w:type="dxa"/>
-        <w:tblInd w:w="108" w:type="dxa"/>
-        <w:tblLayout w:type="fixed"/>
-        <w:tblLook w:val="0000" w:firstRow="0" w:lastRow="0" w:firstColumn="0" w:lastColumn="0" w:noHBand="0" w:noVBand="0"/>
-      </w:tblPr>
-      <w:tblGrid>
-        <w:gridCol w:w="1843"/>
-        <w:gridCol w:w="283"/>
-        <w:gridCol w:w="7239"/>
-      </w:tblGrid>
-      <w:tr>
-        <w:tc>
-          <w:tcPr>
-            <w:tcW w:w="1843" w:type="dxa"/>
-          </w:tcPr>
-          <w:p>
-            <w:pPr>
-              <w:rPr>
-                <w:rFonts w:ascii="Arial" w:hAnsi="Arial" w:cs="Arial"/>
-              </w:rPr>
-            </w:pPr>
-            <w:proofErr w:type="spellStart"/>
-            <w:r>
-              <w:rPr>
-                <w:rFonts w:ascii="Arial" w:hAnsi="Arial" w:cs="Arial"/>
-              </w:rPr>
-              <w:t>Kepada</w:t>
-            </w:r>
-            <w:proofErr w:type="spellEnd"/>
-          </w:p>
-        </w:tc>
-        <w:tc>
-          <w:tcPr>
-            <w:tcW w:w="283" w:type="dxa"/>
-          </w:tcPr>
-          <w:p>
-            <w:pPr>
-              <w:rPr>
-                <w:rFonts w:ascii="Arial" w:hAnsi="Arial" w:cs="Arial"/>
-              </w:rPr>
-            </w:pPr>
-            <w:r>
-              <w:rPr>
-                <w:rFonts w:ascii="Arial" w:hAnsi="Arial" w:cs="Arial"/>
-              </w:rPr>
-              <w:t>:</w:t>
-            </w:r>
-          </w:p>
-        </w:tc>
-        <w:tc>
-          <w:tcPr>
-            <w:tcW w:w="7239" w:type="dxa"/>
-          </w:tcPr>
-          <w:p>
-            <w:pPr>
-              <w:rPr>
-                <w:rFonts w:ascii="Arial" w:hAnsi="Arial" w:cs="Arial"/>
-              </w:rPr>
-            </w:pPr>
-            <w:r>
-              <w:rPr>
-                <w:rFonts w:ascii="Arial" w:hAnsi="Arial" w:cs="Arial"/>
-              </w:rPr>
-              <w:t>{</w:t>
-            </w:r>
-            <w:proofErr w:type="spellStart"/>
-            <w:r>
-              <w:rPr>
-                <w:rFonts w:ascii="Arial" w:hAnsi="Arial" w:cs="Arial"/>
-              </w:rPr>
-              <w:t>pegawai_list_string</w:t>
-            </w:r>
-            <w:proofErr w:type="spellEnd"/>
-            <w:r>
-              <w:rPr>
-                <w:rFonts w:ascii="Arial" w:hAnsi="Arial" w:cs="Arial"/>
-              </w:rPr>
-              <w:t>}</w:t>
-            </w:r>
-          </w:p>
-          <w:p>
-            <w:pPr>
-              <w:rPr>
-                <w:rFonts w:ascii="Arial" w:hAnsi="Arial" w:cs="Arial"/>
-              </w:rPr>
-            </w:pPr>
-          </w:p>
-        </w:tc>
-      </w:tr>
-      <w:tr>
-        <w:tc>
-          <w:tcPr>
-            <w:tcW w:w="1843" w:type="dxa"/>
-          </w:tcPr>
-          <w:p>
-            <w:pPr>
-              <w:rPr>
-                <w:rFonts w:ascii="Arial" w:hAnsi="Arial" w:cs="Arial"/>
-              </w:rPr>
-            </w:pPr>
-            <w:proofErr w:type="spellStart"/>
-            <w:r>
-              <w:rPr>
-                <w:rFonts w:ascii="Arial" w:hAnsi="Arial" w:cs="Arial"/>
-              </w:rPr>
-              <w:t>Untuk</w:t>
-            </w:r>
-            <w:proofErr w:type="spellEnd"/>
-          </w:p>
-        </w:tc>
-        <w:tc>
-          <w:tcPr>
-            <w:tcW w:w="283" w:type="dxa"/>
-          </w:tcPr>
-          <w:p>
-            <w:pPr>
-              <w:jc w:val="center"/>
-              <w:rPr>
-                <w:rFonts w:ascii="Arial" w:hAnsi="Arial" w:cs="Arial"/>
-                <w:lang w:val="id-ID"/>
-              </w:rPr>
-            </w:pPr>
-            <w:r>
-              <w:rPr>
-                <w:rFonts w:ascii="Arial" w:hAnsi="Arial" w:cs="Arial"/>
-                <w:lang w:val="id-ID"/>
-              </w:rPr>
-              <w:t>:</w:t>
-            </w:r>
-          </w:p>
-        </w:tc>
-        <w:tc>
-          <w:tcPr>
-            <w:tcW w:w="7239" w:type="dxa"/>
-          </w:tcPr>
-          <w:p>
-            <w:pPr>
-              <w:rPr>
-                <w:rFonts w:ascii="Arial" w:hAnsi="Arial" w:cs="Arial"/>
-                <w:lang w:val="id-ID"/>
-              </w:rPr>
-            </w:pPr>
-            <w:r>
-              <w:rPr>
-                <w:rFonts w:ascii="Arial" w:hAnsi="Arial" w:cs="Arial"/>
-                <w:lang w:val="id-ID"/>
-              </w:rPr>
-              <w:t>Mengikuti {tujuan_kegiatan} pada tanggal {tanggal_mulai} s.d {tanggal_selesai}</w:t>
-            </w:r>
-          </w:p>
-          <w:p>
-            <w:pPr>
-              <w:rPr>
-                <w:rFonts w:ascii="Arial" w:hAnsi="Arial" w:cs="Arial"/>
-                <w:lang w:val="id-ID"/>
-              </w:rPr>
-            </w:pPr>
-          </w:p>
-          <w:p>
-            <w:pPr>
-              <w:rPr>
-                <w:rFonts w:ascii="Arial" w:hAnsi="Arial" w:cs="Arial"/>
-                <w:lang w:val="id-ID"/>
-              </w:rPr>
-            </w:pPr>
-            <w:r>
-              <w:rPr>
-                <w:rFonts w:ascii="Arial" w:hAnsi="Arial" w:cs="Arial"/>
-                <w:lang w:val="id-ID"/>
-              </w:rPr>
-              <w:t>Setelah selesai melaksanakan tugas ini segera membuat laporan</w:t>
-            </w:r>
-            <w:r>
-              <w:rPr>
-                <w:rFonts w:ascii="Arial" w:hAnsi="Arial" w:cs="Arial"/>
-                <w:lang w:val="id-ID"/>
-              </w:rPr>
-              <w:t xml:space="preserve"> </w:t>
-            </w:r>
-            <w:r>
-              <w:rPr>
-                <w:rFonts w:ascii="Arial" w:hAnsi="Arial" w:cs="Arial"/>
-                <w:lang w:val="id-ID"/>
-              </w:rPr>
-              <w:t>tertulis kepada pimpinan terkait</w:t>
-            </w:r>
-            <w:r>
-              <w:rPr>
-                <w:rFonts w:ascii="Arial" w:hAnsi="Arial" w:cs="Arial"/>
-                <w:lang w:val="id-ID"/>
-              </w:rPr>
-              <w:t>.</w:t>
-            </w:r>
-          </w:p>
-          <w:p>
-            <w:pPr>
-              <w:jc w:val="both"/>
-              <w:rPr>
-                <w:rFonts w:ascii="Arial" w:eastAsia="Calibri" w:hAnsi="Arial" w:cs="Arial"/>
-                <w:lang w:val="id-ID"/>
-              </w:rPr>
-            </w:pPr>
-          </w:p>
-        </w:tc>
-      </w:tr>
-    </w:tbl>
-    <w:p>
-      <w:pPr>
-        <w:pStyle w:val="Subtitle"/>
-        <w:ind w:left="4680" w:firstLineChars="350" w:firstLine="840"/>
-        <w:jc w:val="left"/>
-        <w:rPr>
-          <w:rFonts w:ascii="Arial" w:hAnsi="Arial"/>
-          <w:lang w:val="id-ID"/>
-        </w:rPr>
-      </w:pPr>
-      <w:r>
-        <w:rPr>
-          <w:rFonts w:ascii="Arial" w:hAnsi="Arial"/>
-          <w:lang w:val="id-ID"/>
-        </w:rPr>
-        <w:t xml:space="preserve">Padang, </w:t>
-      </w:r>
-      <w:r>
-        <w:rPr>
-          <w:rFonts w:ascii="Arial" w:hAnsi="Arial"/>
-        </w:rPr>
-        <w:t>{</w:t>
-      </w:r>
-      <w:proofErr w:type="spellStart"/>
-      <w:r>
-        <w:rPr>
-          <w:rFonts w:ascii="Arial" w:hAnsi="Arial"/>
-        </w:rPr>
-        <w:t>tanggal_surat</w:t>
-      </w:r>
-      <w:proofErr w:type="spellEnd"/>
-      <w:r>
-        <w:rPr>
-          <w:rFonts w:ascii="Arial" w:hAnsi="Arial"/>
-        </w:rPr>
-        <w:t>}</w:t>
-      </w:r>
-    </w:p>
-    <w:p>
-      <w:pPr>
-        <w:tabs>
-          <w:tab w:val="left" w:pos="5529"/>
-        </w:tabs>
-        <w:ind w:left="4680" w:firstLine="282"/>
-        <w:jc w:val="both"/>
-        <w:rPr>
-          <w:rFonts w:ascii="Arial" w:hAnsi="Arial"/>
-          <w:lang w:val="id-ID"/>
-        </w:rPr>
-      </w:pPr>
-      <w:r>
-        <w:rPr>
-          <w:rFonts w:ascii="Arial" w:hAnsi="Arial"/>
-          <w:lang w:val="id-ID"/>
-        </w:rPr>
-        <w:tab/>
-        <w:t>Dekan</w:t>
-      </w:r>
-    </w:p>
-    <w:p>
-      <w:pPr>
-        <w:ind w:firstLine="4860"/>
-        <w:jc w:val="both"/>
-        <w:rPr>
-          <w:rFonts w:ascii="Arial" w:hAnsi="Arial"/>
-        </w:rPr>
-      </w:pPr>
-    </w:p>
-    <w:p>
-      <w:pPr>
-        <w:jc w:val="both"/>
-        <w:rPr>
-          <w:rFonts w:ascii="Arial" w:hAnsi="Arial"/>
-          <w:lang w:val="id-ID"/>
-        </w:rPr>
-      </w:pPr>
-      <w:r>
-        <w:rPr>
-          <w:rFonts w:ascii="Arial" w:hAnsi="Arial"/>
-          <w:lang w:val="id-ID"/>
-        </w:rPr>
-        <w:tab/>
-      </w:r>
-      <w:r>
-        <w:rPr>
-          <w:rFonts w:ascii="Arial" w:hAnsi="Arial"/>
-          <w:lang w:val="id-ID"/>
-        </w:rPr>
-        <w:tab/>
-      </w:r>
-      <w:r>
-        <w:rPr>
-          <w:rFonts w:ascii="Arial" w:hAnsi="Arial"/>
-          <w:lang w:val="id-ID"/>
-        </w:rPr>
-        <w:tab/>
-      </w:r>
-      <w:r>
-        <w:rPr>
-          <w:rFonts w:ascii="Arial" w:hAnsi="Arial"/>
-          <w:lang w:val="id-ID"/>
-        </w:rPr>
-        <w:tab/>
-      </w:r>
-      <w:r>
-        <w:rPr>
-          <w:rFonts w:ascii="Arial" w:hAnsi="Arial"/>
-          <w:lang w:val="id-ID"/>
-        </w:rPr>
-        <w:tab/>
-      </w:r>
-      <w:r>
-        <w:rPr>
-          <w:rFonts w:ascii="Arial" w:hAnsi="Arial"/>
-          <w:lang w:val="id-ID"/>
-        </w:rPr>
-        <w:tab/>
-      </w:r>
-      <w:r>
-        <w:rPr>
-          <w:rFonts w:ascii="Arial" w:hAnsi="Arial"/>
-          <w:lang w:val="id-ID"/>
-        </w:rPr>
-        <w:tab/>
-      </w:r>
-      <w:r>
-        <w:rPr>
-          <w:rFonts w:ascii="Arial" w:hAnsi="Arial"/>
-          <w:lang w:val="id-ID"/>
-        </w:rPr>
-        <w:tab/>
-      </w:r>
-    </w:p>
-    <w:p>
-      <w:pPr>
-        <w:jc w:val="both"/>
-        <w:rPr>
-          <w:rFonts w:ascii="Arial" w:hAnsi="Arial"/>
-          <w:lang w:val="id-ID"/>
-        </w:rPr>
-      </w:pPr>
-    </w:p>
-    <w:p>
-      <w:pPr>
-        <w:ind w:left="5529"/>
-        <w:jc w:val="both"/>
-        <w:rPr>
-          <w:rFonts w:ascii="Arial" w:hAnsi="Arial"/>
-          <w:b/>
-          <w:bCs/>
-          <w:lang w:val="id-ID"/>
-        </w:rPr>
-      </w:pPr>
-      <w:r>
-        <w:rPr>
-          <w:rFonts w:ascii="Arial" w:hAnsi="Arial"/>
-          <w:b/>
-          <w:bCs/>
-          <w:lang w:val="id-ID"/>
-        </w:rPr>
-        <w:t>.................................</w:t>
-      </w:r>
-    </w:p>
-    <w:p>
-      <w:pPr>
-        <w:ind w:left="5529"/>
-        <w:jc w:val="both"/>
-        <w:rPr>
-          <w:rFonts w:ascii="Arial" w:hAnsi="Arial"/>
-          <w:lang w:val="id-ID"/>
-        </w:rPr>
-      </w:pPr>
-      <w:r>
-        <w:rPr>
-          <w:rFonts w:ascii="Arial" w:hAnsi="Arial"/>
-          <w:lang w:val="id-ID"/>
-        </w:rPr>
-        <w:t>{nama</w:t>
-      </w:r>
-      <w:r>
-        <w:rPr>
-          <w:rFonts w:ascii="Arial" w:hAnsi="Arial"/>
-          <w:lang w:val="id-ID"/>
-        </w:rPr>
-        <w:t>_</w:t>
-      </w:r>
-      <w:r>
-        <w:rPr>
-          <w:rFonts w:ascii="Arial" w:hAnsi="Arial"/>
-          <w:lang w:val="id-ID"/>
-        </w:rPr>
-        <w:t>dekan}</w:t>
-      </w:r>
-    </w:p>
-    <w:p>
-      <w:pPr>
-        <w:ind w:left="3402"/>
-        <w:jc w:val="both"/>
-        <w:rPr>
-          <w:rFonts w:ascii="Arial" w:hAnsi="Arial"/>
-          <w:lang w:val="id-ID"/>
-        </w:rPr>
-      </w:pPr>
-    </w:p>
     <w:sectPr>
       <w:pgSz w:w="11907" w:h="16839"/>
       <w:pgMar w:top="850" w:right="1134" w:bottom="850" w:left="1559" w:header="720" w:footer="720" w:gutter="0"/>
@@ -3875,7 +2271,7 @@
 </file>
 
 <file path=word/numbering.xml><?xml version="1.0" encoding="utf-8"?>
-<w:numbering xmlns:wpc="http://schemas.microsoft.com/office/word/2010/wordprocessingCanvas" xmlns:cx="http://schemas.microsoft.com/office/drawing/2014/chartex" xmlns:cx1="http://schemas.microsoft.com/office/drawing/2015/9/8/chartex" xmlns:cx2="http://schemas.microsoft.com/office/drawing/2015/10/21/chartex" xmlns:cx3="http://schemas.microsoft.com/office/drawing/2016/5/9/chartex" xmlns:cx4="http://schemas.microsoft.com/office/drawing/2016/5/10/chartex" xmlns:cx5="http://schemas.microsoft.com/office/drawing/2016/5/11/chartex" xmlns:cx6="http://schemas.microsoft.com/office/drawing/2016/5/12/chartex" xmlns:cx7="http://schemas.microsoft.com/office/drawing/2016/5/13/chartex" xmlns:cx8="http://schemas.microsoft.com/office/drawing/2016/5/14/chartex" xmlns:mc="http://schemas.openxmlformats.org/markup-compatibility/2006" xmlns:aink="http://schemas.microsoft.com/office/drawing/2016/ink" xmlns:am3d="http://schemas.microsoft.com/office/drawing/2017/model3d" xmlns:o="urn:schemas-microsoft-com:office:office" xmlns:oel="http://schemas.microsoft.com/office/2019/extlst" xmlns:r="http://schemas.openxmlformats.org/officeDocument/2006/relationships" xmlns:m="http://schemas.openxmlformats.org/officeDocument/2006/math" xmlns:v="urn:schemas-microsoft-com:vml" xmlns:wp14="http://schemas.microsoft.com/office/word/2010/wordprocessingDrawing" xmlns:wp="http://schemas.openxmlformats.org/drawingml/2006/wordprocessingDrawing" xmlns:w10="urn:schemas-microsoft-com:office:word" xmlns:w="http://schemas.openxmlformats.org/wordprocessingml/2006/main" xmlns:w14="http://schemas.microsoft.com/office/word/2010/wordml" xmlns:w15="http://schemas.microsoft.com/office/word/2012/wordml" xmlns:w16cex="http://schemas.microsoft.com/office/word/2018/wordml/cex" xmlns:w16cid="http://schemas.microsoft.com/office/word/2016/wordml/cid" xmlns:w16="http://schemas.microsoft.com/office/word/2018/wordml" xmlns:w16du="http://schemas.microsoft.com/office/word/2023/wordml/word16du" xmlns:w16sdtdh="http://schemas.microsoft.com/office/word/2020/wordml/sdtdatahash" xmlns:w16sdtfl="http://schemas.microsoft.com/office/word/2024/wordml/sdtformatlock" xmlns:w16se="http://schemas.microsoft.com/office/word/2015/wordml/symex" xmlns:wpg="http://schemas.microsoft.com/office/word/2010/wordprocessingGroup" xmlns:wpi="http://schemas.microsoft.com/office/word/2010/wordprocessingInk" xmlns:wne="http://schemas.microsoft.com/office/word/2006/wordml" xmlns:wps="http://schemas.microsoft.com/office/word/2010/wordprocessingShape" mc:Ignorable="w14 w15 w16se w16cid w16 w16cex w16sdtdh w16sdtfl w16du wp14">
+<w:numbering xmlns:wpc="http://schemas.microsoft.com/office/word/2010/wordprocessingCanvas" xmlns:cx="http://schemas.microsoft.com/office/drawing/2014/chartex" xmlns:cx1="http://schemas.microsoft.com/office/drawing/2015/9/8/chartex" xmlns:cx2="http://schemas.microsoft.com/office/drawing/2015/10/21/chartex" xmlns:cx3="http://schemas.microsoft.com/office/drawing/2016/5/9/chartex" xmlns:cx4="http://schemas.microsoft.com/office/drawing/2016/5/10/chartex" xmlns:cx5="http://schemas.microsoft.com/office/drawing/2016/5/11/chartex" xmlns:cx6="http://schemas.microsoft.com/office/drawing/2016/5/12/chartex" xmlns:cx7="http://schemas.microsoft.com/office/drawing/2016/5/13/chartex" xmlns:cx8="http://schemas.microsoft.com/office/drawing/2016/5/14/chartex" xmlns:mc="http://schemas.openxmlformats.org/markup-compatibility/2006" xmlns:aink="http://schemas.microsoft.com/office/drawing/2016/ink" xmlns:am3d="http://schemas.microsoft.com/office/drawing/2017/model3d" xmlns:o="urn:schemas-microsoft-com:office:office" xmlns:oel="http://schemas.microsoft.com/office/2019/extlst" xmlns:r="http://schemas.openxmlformats.org/officeDocument/2006/relationships" xmlns:m="http://schemas.openxmlformats.org/officeDocument/2006/math" xmlns:v="urn:schemas-microsoft-com:vml" xmlns:wp14="http://schemas.microsoft.com/office/word/2010/wordprocessingDrawing" xmlns:wp="http://schemas.openxmlformats.org/drawingml/2006/wordprocessingDrawing" xmlns:w10="urn:schemas-microsoft-com:office:word" xmlns:w="http://schemas.openxmlformats.org/wordprocessingml/2006/main" xmlns:w14="http://schemas.microsoft.com/office/word/2010/wordml" xmlns:w15="http://schemas.microsoft.com/office/word/2012/wordml" xmlns:w16cex="http://schemas.microsoft.com/office/word/2018/wordml/cex" xmlns:w16cid="http://schemas.microsoft.com/office/word/2016/wordml/cid" xmlns:w16="http://schemas.microsoft.com/office/word/2018/wordml" xmlns:w16du="http://schemas.microsoft.com/office/word/2023/wordml/word16du" xmlns:w16sdtdh="http://schemas.microsoft.com/office/word/2020/wordml/sdtdatahash" xmlns:w16se="http://schemas.microsoft.com/office/word/2015/wordml/symex" xmlns:wpg="http://schemas.microsoft.com/office/word/2010/wordprocessingGroup" xmlns:wpi="http://schemas.microsoft.com/office/word/2010/wordprocessingInk" xmlns:wne="http://schemas.microsoft.com/office/word/2006/wordml" xmlns:wps="http://schemas.microsoft.com/office/word/2010/wordprocessingShape" mc:Ignorable="w14 w15 w16se w16cid w16 w16cex w16sdtdh wp14">
   <w:abstractNum w:abstractNumId="0" w15:restartNumberingAfterBreak="0">
     <w:nsid w:val="9E616079"/>
     <w:multiLevelType w:val="singleLevel"/>
@@ -4130,7 +2526,7 @@
 </file>
 
 <file path=word/styles.xml><?xml version="1.0" encoding="utf-8"?>
-<w:styles xmlns:mc="http://schemas.openxmlformats.org/markup-compatibility/2006" xmlns:r="http://schemas.openxmlformats.org/officeDocument/2006/relationships" xmlns:w="http://schemas.openxmlformats.org/wordprocessingml/2006/main" xmlns:w14="http://schemas.microsoft.com/office/word/2010/wordml" xmlns:w15="http://schemas.microsoft.com/office/word/2012/wordml" xmlns:w16cex="http://schemas.microsoft.com/office/word/2018/wordml/cex" xmlns:w16cid="http://schemas.microsoft.com/office/word/2016/wordml/cid" xmlns:w16="http://schemas.microsoft.com/office/word/2018/wordml" xmlns:w16du="http://schemas.microsoft.com/office/word/2023/wordml/word16du" xmlns:w16sdtdh="http://schemas.microsoft.com/office/word/2020/wordml/sdtdatahash" xmlns:w16sdtfl="http://schemas.microsoft.com/office/word/2024/wordml/sdtformatlock" xmlns:w16se="http://schemas.microsoft.com/office/word/2015/wordml/symex" mc:Ignorable="w14 w15 w16se w16cid w16 w16cex w16sdtdh w16sdtfl w16du">
+<w:styles xmlns:mc="http://schemas.openxmlformats.org/markup-compatibility/2006" xmlns:r="http://schemas.openxmlformats.org/officeDocument/2006/relationships" xmlns:w="http://schemas.openxmlformats.org/wordprocessingml/2006/main" xmlns:w14="http://schemas.microsoft.com/office/word/2010/wordml" xmlns:w15="http://schemas.microsoft.com/office/word/2012/wordml" xmlns:w16cex="http://schemas.microsoft.com/office/word/2018/wordml/cex" xmlns:w16cid="http://schemas.microsoft.com/office/word/2016/wordml/cid" xmlns:w16="http://schemas.microsoft.com/office/word/2018/wordml" xmlns:w16sdtdh="http://schemas.microsoft.com/office/word/2020/wordml/sdtdatahash" xmlns:w16se="http://schemas.microsoft.com/office/word/2015/wordml/symex" mc:Ignorable="w14 w15 w16se w16cid w16 w16cex w16sdtdh">
   <w:docDefaults>
     <w:rPrDefault>
       <w:rPr>

</xml_diff>